<commit_message>
Actualización del documento de Roles y responsabilidades
</commit_message>
<xml_diff>
--- a/Documentación/Documento de Roles y Responsabilidades del Equipo de Desarrollo.docx
+++ b/Documentación/Documento de Roles y Responsabilidades del Equipo de Desarrollo.docx
@@ -260,10 +260,7 @@
           </w:tcPr>
           <w:p>
             <w:r>
-              <w:t xml:space="preserve">Christian Barragan </w:t>
-            </w:r>
-            <w:r>
-              <w:t>Páez</w:t>
+              <w:t>Christian Barragan Páez</w:t>
             </w:r>
           </w:p>
         </w:tc>
@@ -584,25 +581,13 @@
         <w:t xml:space="preserve">David Pulido Sorcia, </w:t>
       </w:r>
       <w:r>
-        <w:t xml:space="preserve">Daniel </w:t>
-      </w:r>
-      <w:r>
-        <w:t>López</w:t>
-      </w:r>
-      <w:r>
-        <w:t xml:space="preserve"> Beristain, Christian Barragan </w:t>
-      </w:r>
-      <w:r>
-        <w:t>Páez</w:t>
+        <w:t>Daniel López Beristain, Christian Barragan Páez</w:t>
       </w:r>
       <w:r>
         <w:t xml:space="preserve"> y </w:t>
       </w:r>
       <w:r>
-        <w:t>Carlos</w:t>
-      </w:r>
-      <w:r>
-        <w:t xml:space="preserve"> Gabriel Bañuelos Cano</w:t>
+        <w:t>Carlos Gabriel Bañuelos Cano</w:t>
       </w:r>
     </w:p>
     <w:p>
@@ -674,11 +659,14 @@
       </w:r>
     </w:p>
     <w:p/>
+    <w:p/>
+    <w:p/>
     <w:p>
       <w:pPr>
         <w:pStyle w:val="Ttulo2"/>
       </w:pPr>
       <w:r>
+        <w:lastRenderedPageBreak/>
         <w:t>Compromisos del Equipo</w:t>
       </w:r>
     </w:p>
@@ -711,7 +699,6 @@
           <w:b/>
           <w:bCs/>
         </w:rPr>
-        <w:lastRenderedPageBreak/>
         <w:t>Asistencia y Puntualidad:</w:t>
       </w:r>
       <w:r>
@@ -788,7 +775,484 @@
       </w:r>
     </w:p>
     <w:p/>
-    <w:p/>
+    <w:p>
+      <w:pPr>
+        <w:pStyle w:val="Ttulo2"/>
+      </w:pPr>
+      <w:r>
+        <w:t>Normas Básicas de Trabajo Colaborativo</w:t>
+      </w:r>
+    </w:p>
+    <w:p>
+      <w:r>
+        <w:t xml:space="preserve">Para mantener un ambiente profesional, eficiente y armonioso, </w:t>
+      </w:r>
+      <w:r>
+        <w:rPr>
+          <w:b/>
+          <w:bCs/>
+        </w:rPr>
+        <w:t>Elian, David, Daniel, Christian y Carlos</w:t>
+      </w:r>
+      <w:r>
+        <w:t xml:space="preserve"> acuerdan cumplir con las siguientes normas básicas:</w:t>
+      </w:r>
+    </w:p>
+    <w:p>
+      <w:pPr>
+        <w:pStyle w:val="Prrafodelista"/>
+        <w:numPr>
+          <w:ilvl w:val="0"/>
+          <w:numId w:val="8"/>
+        </w:numPr>
+        <w:rPr>
+          <w:b/>
+          <w:bCs/>
+        </w:rPr>
+      </w:pPr>
+      <w:r>
+        <w:rPr>
+          <w:b/>
+          <w:bCs/>
+        </w:rPr>
+        <w:t>Comunicación Efectiva y Canales Oficiales</w:t>
+      </w:r>
+    </w:p>
+    <w:p>
+      <w:pPr>
+        <w:pStyle w:val="Prrafodelista"/>
+        <w:rPr>
+          <w:b/>
+          <w:bCs/>
+        </w:rPr>
+      </w:pPr>
+    </w:p>
+    <w:p>
+      <w:pPr>
+        <w:pStyle w:val="Prrafodelista"/>
+        <w:numPr>
+          <w:ilvl w:val="0"/>
+          <w:numId w:val="7"/>
+        </w:numPr>
+      </w:pPr>
+      <w:r>
+        <w:rPr>
+          <w:b/>
+          <w:bCs/>
+        </w:rPr>
+        <w:t>Centralización de la información:</w:t>
+      </w:r>
+      <w:r>
+        <w:t xml:space="preserve"> Toda la comunicación técnica y del proyecto se mantendrá en los canales oficiales acordados. Se evitará tomar decisiones importantes por canales informales.</w:t>
+      </w:r>
+    </w:p>
+    <w:p>
+      <w:pPr>
+        <w:pStyle w:val="Prrafodelista"/>
+        <w:numPr>
+          <w:ilvl w:val="0"/>
+          <w:numId w:val="7"/>
+        </w:numPr>
+      </w:pPr>
+      <w:r>
+        <w:rPr>
+          <w:b/>
+          <w:bCs/>
+        </w:rPr>
+        <w:t>Respuesta oportuna:</w:t>
+      </w:r>
+      <w:r>
+        <w:t xml:space="preserve"> Los miembros del equipo se comprometen a responder los mensajes directos o menciones importantes dentro de un horario laboral razonable.</w:t>
+      </w:r>
+    </w:p>
+    <w:p>
+      <w:pPr>
+        <w:pStyle w:val="Prrafodelista"/>
+        <w:numPr>
+          <w:ilvl w:val="0"/>
+          <w:numId w:val="7"/>
+        </w:numPr>
+      </w:pPr>
+      <w:r>
+        <w:rPr>
+          <w:b/>
+          <w:bCs/>
+        </w:rPr>
+        <w:t>Respeto y empatía:</w:t>
+      </w:r>
+      <w:r>
+        <w:t xml:space="preserve"> Se mantendrá un tono profesional y constructivo en todo momento. Las críticas constructivas siempre se enfocarán en el trabajo o el código, nunca en la persona.</w:t>
+      </w:r>
+    </w:p>
+    <w:p>
+      <w:pPr>
+        <w:pStyle w:val="Prrafodelista"/>
+      </w:pPr>
+    </w:p>
+    <w:p>
+      <w:pPr>
+        <w:pStyle w:val="Prrafodelista"/>
+        <w:tabs>
+          <w:tab w:val="left" w:pos="2475"/>
+        </w:tabs>
+      </w:pPr>
+      <w:r>
+        <w:tab/>
+      </w:r>
+    </w:p>
+    <w:p>
+      <w:pPr>
+        <w:pStyle w:val="Prrafodelista"/>
+        <w:numPr>
+          <w:ilvl w:val="0"/>
+          <w:numId w:val="8"/>
+        </w:numPr>
+        <w:rPr>
+          <w:b/>
+          <w:bCs/>
+          <w:sz w:val="24"/>
+          <w:szCs w:val="24"/>
+        </w:rPr>
+      </w:pPr>
+      <w:r>
+        <w:rPr>
+          <w:b/>
+          <w:bCs/>
+          <w:sz w:val="24"/>
+          <w:szCs w:val="24"/>
+        </w:rPr>
+        <w:t>Dinámica de Reuniones</w:t>
+      </w:r>
+    </w:p>
+    <w:p>
+      <w:pPr>
+        <w:pStyle w:val="NormalWeb"/>
+        <w:numPr>
+          <w:ilvl w:val="0"/>
+          <w:numId w:val="7"/>
+        </w:numPr>
+        <w:rPr>
+          <w:rFonts w:asciiTheme="minorHAnsi" w:hAnsiTheme="minorHAnsi" w:cstheme="minorHAnsi"/>
+          <w:sz w:val="22"/>
+          <w:szCs w:val="22"/>
+        </w:rPr>
+      </w:pPr>
+      <w:r>
+        <w:rPr>
+          <w:rFonts w:asciiTheme="minorHAnsi" w:hAnsiTheme="minorHAnsi" w:cstheme="minorHAnsi"/>
+          <w:b/>
+          <w:bCs/>
+          <w:sz w:val="22"/>
+          <w:szCs w:val="22"/>
+        </w:rPr>
+        <w:t>Puntualidad rigurosa:</w:t>
+      </w:r>
+      <w:r>
+        <w:rPr>
+          <w:rFonts w:asciiTheme="minorHAnsi" w:hAnsiTheme="minorHAnsi" w:cstheme="minorHAnsi"/>
+          <w:sz w:val="22"/>
+          <w:szCs w:val="22"/>
+        </w:rPr>
+        <w:t xml:space="preserve"> Las reuniones comenzarán a la hora exacta programada. Si un integrante no puede asistir o llegará tarde, deberá notificarlo al Scrum Master con la mayor anticipación posible.</w:t>
+      </w:r>
+    </w:p>
+    <w:p>
+      <w:pPr>
+        <w:pStyle w:val="NormalWeb"/>
+        <w:numPr>
+          <w:ilvl w:val="0"/>
+          <w:numId w:val="7"/>
+        </w:numPr>
+        <w:rPr>
+          <w:rFonts w:asciiTheme="minorHAnsi" w:hAnsiTheme="minorHAnsi" w:cstheme="minorHAnsi"/>
+          <w:sz w:val="22"/>
+          <w:szCs w:val="22"/>
+        </w:rPr>
+      </w:pPr>
+      <w:r>
+        <w:rPr>
+          <w:rFonts w:asciiTheme="minorHAnsi" w:hAnsiTheme="minorHAnsi" w:cstheme="minorHAnsi"/>
+          <w:b/>
+          <w:bCs/>
+          <w:sz w:val="22"/>
+          <w:szCs w:val="22"/>
+        </w:rPr>
+        <w:t>Foco y brevedad:</w:t>
+      </w:r>
+      <w:r>
+        <w:rPr>
+          <w:rFonts w:asciiTheme="minorHAnsi" w:hAnsiTheme="minorHAnsi" w:cstheme="minorHAnsi"/>
+          <w:sz w:val="22"/>
+          <w:szCs w:val="22"/>
+        </w:rPr>
+        <w:t xml:space="preserve"> Durante la </w:t>
+      </w:r>
+      <w:r>
+        <w:rPr>
+          <w:rFonts w:asciiTheme="minorHAnsi" w:hAnsiTheme="minorHAnsi" w:cstheme="minorHAnsi"/>
+          <w:i/>
+          <w:iCs/>
+          <w:sz w:val="22"/>
+          <w:szCs w:val="22"/>
+        </w:rPr>
+        <w:t>Daily</w:t>
+      </w:r>
+      <w:r>
+        <w:rPr>
+          <w:rFonts w:asciiTheme="minorHAnsi" w:hAnsiTheme="minorHAnsi" w:cstheme="minorHAnsi"/>
+          <w:sz w:val="22"/>
+          <w:szCs w:val="22"/>
+        </w:rPr>
+        <w:t xml:space="preserve"> (reunión diaria de 15 minutos), cada miembro irá directo al punto respondiendo de forma concisa qué hizo ayer, qué hará hoy y si tiene bloqueos, evitando debates técnicos profundos que deban tratarse por separado.</w:t>
+      </w:r>
+    </w:p>
+    <w:p>
+      <w:pPr>
+        <w:pStyle w:val="NormalWeb"/>
+        <w:numPr>
+          <w:ilvl w:val="0"/>
+          <w:numId w:val="7"/>
+        </w:numPr>
+        <w:rPr>
+          <w:rFonts w:asciiTheme="minorHAnsi" w:hAnsiTheme="minorHAnsi" w:cstheme="minorHAnsi"/>
+          <w:sz w:val="22"/>
+          <w:szCs w:val="22"/>
+        </w:rPr>
+      </w:pPr>
+      <w:r>
+        <w:rPr>
+          <w:rFonts w:asciiTheme="minorHAnsi" w:hAnsiTheme="minorHAnsi" w:cstheme="minorHAnsi"/>
+          <w:b/>
+          <w:bCs/>
+          <w:sz w:val="22"/>
+          <w:szCs w:val="22"/>
+        </w:rPr>
+        <w:t>Cámara y participación:</w:t>
+      </w:r>
+      <w:r>
+        <w:rPr>
+          <w:rFonts w:asciiTheme="minorHAnsi" w:hAnsiTheme="minorHAnsi" w:cstheme="minorHAnsi"/>
+          <w:sz w:val="22"/>
+          <w:szCs w:val="22"/>
+        </w:rPr>
+        <w:t xml:space="preserve"> En reuniones virtuales, se recomienda encender la cámara (especialmente en la Planeación y la Retrospectiva) para fomentar una mejor conexión y asegurar que todos participen activamente.</w:t>
+      </w:r>
+    </w:p>
+    <w:p>
+      <w:pPr>
+        <w:pStyle w:val="NormalWeb"/>
+        <w:ind w:left="720"/>
+        <w:rPr>
+          <w:rFonts w:asciiTheme="minorHAnsi" w:hAnsiTheme="minorHAnsi" w:cstheme="minorHAnsi"/>
+          <w:sz w:val="22"/>
+          <w:szCs w:val="22"/>
+        </w:rPr>
+      </w:pPr>
+    </w:p>
+    <w:p>
+      <w:pPr>
+        <w:pStyle w:val="NormalWeb"/>
+        <w:numPr>
+          <w:ilvl w:val="0"/>
+          <w:numId w:val="8"/>
+        </w:numPr>
+        <w:rPr>
+          <w:rFonts w:asciiTheme="minorHAnsi" w:hAnsiTheme="minorHAnsi" w:cstheme="minorHAnsi"/>
+          <w:b/>
+          <w:bCs/>
+        </w:rPr>
+      </w:pPr>
+      <w:r>
+        <w:rPr>
+          <w:rFonts w:asciiTheme="minorHAnsi" w:hAnsiTheme="minorHAnsi" w:cstheme="minorHAnsi"/>
+          <w:b/>
+          <w:bCs/>
+        </w:rPr>
+        <w:lastRenderedPageBreak/>
+        <w:t>Gestión del Tablero y Flujo de Trabajo</w:t>
+      </w:r>
+    </w:p>
+    <w:p>
+      <w:pPr>
+        <w:pStyle w:val="NormalWeb"/>
+        <w:numPr>
+          <w:ilvl w:val="0"/>
+          <w:numId w:val="7"/>
+        </w:numPr>
+        <w:rPr>
+          <w:rFonts w:asciiTheme="minorHAnsi" w:hAnsiTheme="minorHAnsi" w:cstheme="minorHAnsi"/>
+          <w:sz w:val="22"/>
+          <w:szCs w:val="22"/>
+        </w:rPr>
+      </w:pPr>
+      <w:r>
+        <w:rPr>
+          <w:rFonts w:asciiTheme="minorHAnsi" w:hAnsiTheme="minorHAnsi" w:cstheme="minorHAnsi"/>
+          <w:b/>
+          <w:bCs/>
+          <w:sz w:val="22"/>
+          <w:szCs w:val="22"/>
+        </w:rPr>
+        <w:t>Actualización en tiempo real:</w:t>
+      </w:r>
+      <w:r>
+        <w:rPr>
+          <w:rFonts w:asciiTheme="minorHAnsi" w:hAnsiTheme="minorHAnsi" w:cstheme="minorHAnsi"/>
+          <w:sz w:val="22"/>
+          <w:szCs w:val="22"/>
+        </w:rPr>
+        <w:t xml:space="preserve"> Nadie debe empezar una tarea sin moverla primero al estado "En Progreso" en el tablero. El estado de las tareas debe reflejar la realidad del proyecto en todo momento.</w:t>
+      </w:r>
+    </w:p>
+    <w:p>
+      <w:pPr>
+        <w:pStyle w:val="NormalWeb"/>
+        <w:numPr>
+          <w:ilvl w:val="0"/>
+          <w:numId w:val="7"/>
+        </w:numPr>
+        <w:rPr>
+          <w:rFonts w:asciiTheme="minorHAnsi" w:hAnsiTheme="minorHAnsi" w:cstheme="minorHAnsi"/>
+          <w:sz w:val="22"/>
+          <w:szCs w:val="22"/>
+        </w:rPr>
+      </w:pPr>
+      <w:r>
+        <w:rPr>
+          <w:rFonts w:asciiTheme="minorHAnsi" w:hAnsiTheme="minorHAnsi" w:cstheme="minorHAnsi"/>
+          <w:b/>
+          <w:bCs/>
+          <w:sz w:val="22"/>
+          <w:szCs w:val="22"/>
+        </w:rPr>
+        <w:t>Cultura de "Terminado" antes de "Empezar":</w:t>
+      </w:r>
+      <w:r>
+        <w:rPr>
+          <w:rFonts w:asciiTheme="minorHAnsi" w:hAnsiTheme="minorHAnsi" w:cstheme="minorHAnsi"/>
+          <w:sz w:val="22"/>
+          <w:szCs w:val="22"/>
+        </w:rPr>
+        <w:t xml:space="preserve"> Antes de tomar una nueva tarea del backlog, el desarrollador debe priorizar ayudar a un compañero a terminar una tarea retrasada o avanzar con los detalles de las que ya están en proceso.</w:t>
+      </w:r>
+    </w:p>
+    <w:p>
+      <w:pPr>
+        <w:pStyle w:val="NormalWeb"/>
+        <w:numPr>
+          <w:ilvl w:val="0"/>
+          <w:numId w:val="8"/>
+        </w:numPr>
+        <w:rPr>
+          <w:rFonts w:asciiTheme="minorHAnsi" w:hAnsiTheme="minorHAnsi" w:cstheme="minorHAnsi"/>
+          <w:b/>
+          <w:bCs/>
+        </w:rPr>
+      </w:pPr>
+      <w:r>
+        <w:rPr>
+          <w:rFonts w:asciiTheme="minorHAnsi" w:hAnsiTheme="minorHAnsi" w:cstheme="minorHAnsi"/>
+          <w:b/>
+          <w:bCs/>
+        </w:rPr>
+        <w:t>Gestión del Código y Calidad</w:t>
+      </w:r>
+    </w:p>
+    <w:p>
+      <w:pPr>
+        <w:pStyle w:val="NormalWeb"/>
+        <w:numPr>
+          <w:ilvl w:val="0"/>
+          <w:numId w:val="7"/>
+        </w:numPr>
+        <w:rPr>
+          <w:rFonts w:asciiTheme="minorHAnsi" w:hAnsiTheme="minorHAnsi" w:cstheme="minorHAnsi"/>
+          <w:sz w:val="22"/>
+          <w:szCs w:val="22"/>
+        </w:rPr>
+      </w:pPr>
+      <w:r>
+        <w:rPr>
+          <w:rFonts w:asciiTheme="minorHAnsi" w:hAnsiTheme="minorHAnsi" w:cstheme="minorHAnsi"/>
+          <w:b/>
+          <w:bCs/>
+          <w:sz w:val="22"/>
+          <w:szCs w:val="22"/>
+        </w:rPr>
+        <w:t>Revisiones de Código:</w:t>
+      </w:r>
+      <w:r>
+        <w:rPr>
+          <w:rFonts w:asciiTheme="minorHAnsi" w:hAnsiTheme="minorHAnsi" w:cstheme="minorHAnsi"/>
+          <w:sz w:val="22"/>
+          <w:szCs w:val="22"/>
+        </w:rPr>
+        <w:t xml:space="preserve"> Ningún código se integrará a la rama principal sin haber sido revisado y aprobado por al menos otro desarrollador del equipo. Esto garantiza el aprendizaje mutuo y reduce errores.</w:t>
+      </w:r>
+    </w:p>
+    <w:p>
+      <w:pPr>
+        <w:pStyle w:val="NormalWeb"/>
+        <w:numPr>
+          <w:ilvl w:val="0"/>
+          <w:numId w:val="7"/>
+        </w:numPr>
+        <w:rPr>
+          <w:rFonts w:asciiTheme="minorHAnsi" w:hAnsiTheme="minorHAnsi" w:cstheme="minorHAnsi"/>
+          <w:sz w:val="22"/>
+          <w:szCs w:val="22"/>
+        </w:rPr>
+      </w:pPr>
+      <w:r>
+        <w:rPr>
+          <w:rFonts w:asciiTheme="minorHAnsi" w:hAnsiTheme="minorHAnsi" w:cstheme="minorHAnsi"/>
+          <w:b/>
+          <w:bCs/>
+          <w:sz w:val="22"/>
+          <w:szCs w:val="22"/>
+        </w:rPr>
+        <w:t>Documentación obligatoria:</w:t>
+      </w:r>
+      <w:r>
+        <w:rPr>
+          <w:rFonts w:asciiTheme="minorHAnsi" w:hAnsiTheme="minorHAnsi" w:cstheme="minorHAnsi"/>
+          <w:sz w:val="22"/>
+          <w:szCs w:val="22"/>
+        </w:rPr>
+        <w:t xml:space="preserve"> Cualquier funcionalidad compleja, configuración del entorno o decisión técnica relevante debe quedar documentada en el repositorio o la wiki del proyecto para evitar la dependencia de una sola persona.</w:t>
+      </w:r>
+    </w:p>
+    <w:p>
+      <w:pPr>
+        <w:pStyle w:val="NormalWeb"/>
+        <w:rPr>
+          <w:rFonts w:asciiTheme="minorHAnsi" w:hAnsiTheme="minorHAnsi" w:cstheme="minorHAnsi"/>
+          <w:b/>
+          <w:bCs/>
+        </w:rPr>
+      </w:pPr>
+    </w:p>
+    <w:p>
+      <w:pPr>
+        <w:pStyle w:val="Ttulo2"/>
+      </w:pPr>
+      <w:r>
+        <w:t>Compromiso del Equipo</w:t>
+      </w:r>
+    </w:p>
+    <w:p>
+      <w:r>
+        <w:t>Al adoptar este documento, el equipo asume el compromiso de autogestionarse, apoyarse mutuamente ante las dificultades y priorizar siempre el cumplimiento de la Meta del Sprint por encima de los avances individuales.</w:t>
+      </w:r>
+    </w:p>
+    <w:p>
+      <w:pPr>
+        <w:rPr>
+          <w:b/>
+          <w:bCs/>
+        </w:rPr>
+      </w:pPr>
+    </w:p>
     <w:p/>
     <w:sectPr>
       <w:pgSz w:w="12240" w:h="15840"/>
@@ -803,6 +1267,410 @@
 <file path=word/numbering.xml><?xml version="1.0" encoding="utf-8"?>
 <w:numbering xmlns:wpc="http://schemas.microsoft.com/office/word/2010/wordprocessingCanvas" xmlns:cx="http://schemas.microsoft.com/office/drawing/2014/chartex" xmlns:cx1="http://schemas.microsoft.com/office/drawing/2015/9/8/chartex" xmlns:cx2="http://schemas.microsoft.com/office/drawing/2015/10/21/chartex" xmlns:cx3="http://schemas.microsoft.com/office/drawing/2016/5/9/chartex" xmlns:cx4="http://schemas.microsoft.com/office/drawing/2016/5/10/chartex" xmlns:cx5="http://schemas.microsoft.com/office/drawing/2016/5/11/chartex" xmlns:cx6="http://schemas.microsoft.com/office/drawing/2016/5/12/chartex" xmlns:cx7="http://schemas.microsoft.com/office/drawing/2016/5/13/chartex" xmlns:cx8="http://schemas.microsoft.com/office/drawing/2016/5/14/chartex" xmlns:mc="http://schemas.openxmlformats.org/markup-compatibility/2006" xmlns:aink="http://schemas.microsoft.com/office/drawing/2016/ink" xmlns:am3d="http://schemas.microsoft.com/office/drawing/2017/model3d" xmlns:o="urn:schemas-microsoft-com:office:office" xmlns:oel="http://schemas.microsoft.com/office/2019/extlst" xmlns:r="http://schemas.openxmlformats.org/officeDocument/2006/relationships" xmlns:m="http://schemas.openxmlformats.org/officeDocument/2006/math" xmlns:v="urn:schemas-microsoft-com:vml" xmlns:wp14="http://schemas.microsoft.com/office/word/2010/wordprocessingDrawing" xmlns:wp="http://schemas.openxmlformats.org/drawingml/2006/wordprocessingDrawing" xmlns:w10="urn:schemas-microsoft-com:office:word" xmlns:w="http://schemas.openxmlformats.org/wordprocessingml/2006/main" xmlns:w14="http://schemas.microsoft.com/office/word/2010/wordml" xmlns:w15="http://schemas.microsoft.com/office/word/2012/wordml" xmlns:w16cex="http://schemas.microsoft.com/office/word/2018/wordml/cex" xmlns:w16cid="http://schemas.microsoft.com/office/word/2016/wordml/cid" xmlns:w16="http://schemas.microsoft.com/office/word/2018/wordml" xmlns:w16du="http://schemas.microsoft.com/office/word/2023/wordml/word16du" xmlns:w16sdtdh="http://schemas.microsoft.com/office/word/2020/wordml/sdtdatahash" xmlns:w16sdtfl="http://schemas.microsoft.com/office/word/2024/wordml/sdtformatlock" xmlns:w16se="http://schemas.microsoft.com/office/word/2015/wordml/symex" xmlns:wpg="http://schemas.microsoft.com/office/word/2010/wordprocessingGroup" xmlns:wpi="http://schemas.microsoft.com/office/word/2010/wordprocessingInk" xmlns:wne="http://schemas.microsoft.com/office/word/2006/wordml" xmlns:wps="http://schemas.microsoft.com/office/word/2010/wordprocessingShape" mc:Ignorable="w14 w15 w16se w16cid w16 w16cex w16sdtdh w16sdtfl w16du wp14">
   <w:abstractNum w:abstractNumId="0" w15:restartNumberingAfterBreak="0">
+    <w:nsid w:val="00D224FF"/>
+    <w:multiLevelType w:val="hybridMultilevel"/>
+    <w:tmpl w:val="22C67752"/>
+    <w:lvl w:ilvl="0" w:tplc="080A0001">
+      <w:start w:val="1"/>
+      <w:numFmt w:val="bullet"/>
+      <w:lvlText w:val=""/>
+      <w:lvlJc w:val="left"/>
+      <w:pPr>
+        <w:ind w:left="720" w:hanging="360"/>
+      </w:pPr>
+      <w:rPr>
+        <w:rFonts w:ascii="Symbol" w:hAnsi="Symbol" w:hint="default"/>
+      </w:rPr>
+    </w:lvl>
+    <w:lvl w:ilvl="1" w:tplc="080A0003" w:tentative="1">
+      <w:start w:val="1"/>
+      <w:numFmt w:val="bullet"/>
+      <w:lvlText w:val="o"/>
+      <w:lvlJc w:val="left"/>
+      <w:pPr>
+        <w:ind w:left="1440" w:hanging="360"/>
+      </w:pPr>
+      <w:rPr>
+        <w:rFonts w:ascii="Courier New" w:hAnsi="Courier New" w:cs="Courier New" w:hint="default"/>
+      </w:rPr>
+    </w:lvl>
+    <w:lvl w:ilvl="2" w:tplc="080A0005" w:tentative="1">
+      <w:start w:val="1"/>
+      <w:numFmt w:val="bullet"/>
+      <w:lvlText w:val=""/>
+      <w:lvlJc w:val="left"/>
+      <w:pPr>
+        <w:ind w:left="2160" w:hanging="360"/>
+      </w:pPr>
+      <w:rPr>
+        <w:rFonts w:ascii="Wingdings" w:hAnsi="Wingdings" w:hint="default"/>
+      </w:rPr>
+    </w:lvl>
+    <w:lvl w:ilvl="3" w:tplc="080A0001" w:tentative="1">
+      <w:start w:val="1"/>
+      <w:numFmt w:val="bullet"/>
+      <w:lvlText w:val=""/>
+      <w:lvlJc w:val="left"/>
+      <w:pPr>
+        <w:ind w:left="2880" w:hanging="360"/>
+      </w:pPr>
+      <w:rPr>
+        <w:rFonts w:ascii="Symbol" w:hAnsi="Symbol" w:hint="default"/>
+      </w:rPr>
+    </w:lvl>
+    <w:lvl w:ilvl="4" w:tplc="080A0003" w:tentative="1">
+      <w:start w:val="1"/>
+      <w:numFmt w:val="bullet"/>
+      <w:lvlText w:val="o"/>
+      <w:lvlJc w:val="left"/>
+      <w:pPr>
+        <w:ind w:left="3600" w:hanging="360"/>
+      </w:pPr>
+      <w:rPr>
+        <w:rFonts w:ascii="Courier New" w:hAnsi="Courier New" w:cs="Courier New" w:hint="default"/>
+      </w:rPr>
+    </w:lvl>
+    <w:lvl w:ilvl="5" w:tplc="080A0005" w:tentative="1">
+      <w:start w:val="1"/>
+      <w:numFmt w:val="bullet"/>
+      <w:lvlText w:val=""/>
+      <w:lvlJc w:val="left"/>
+      <w:pPr>
+        <w:ind w:left="4320" w:hanging="360"/>
+      </w:pPr>
+      <w:rPr>
+        <w:rFonts w:ascii="Wingdings" w:hAnsi="Wingdings" w:hint="default"/>
+      </w:rPr>
+    </w:lvl>
+    <w:lvl w:ilvl="6" w:tplc="080A0001" w:tentative="1">
+      <w:start w:val="1"/>
+      <w:numFmt w:val="bullet"/>
+      <w:lvlText w:val=""/>
+      <w:lvlJc w:val="left"/>
+      <w:pPr>
+        <w:ind w:left="5040" w:hanging="360"/>
+      </w:pPr>
+      <w:rPr>
+        <w:rFonts w:ascii="Symbol" w:hAnsi="Symbol" w:hint="default"/>
+      </w:rPr>
+    </w:lvl>
+    <w:lvl w:ilvl="7" w:tplc="080A0003" w:tentative="1">
+      <w:start w:val="1"/>
+      <w:numFmt w:val="bullet"/>
+      <w:lvlText w:val="o"/>
+      <w:lvlJc w:val="left"/>
+      <w:pPr>
+        <w:ind w:left="5760" w:hanging="360"/>
+      </w:pPr>
+      <w:rPr>
+        <w:rFonts w:ascii="Courier New" w:hAnsi="Courier New" w:cs="Courier New" w:hint="default"/>
+      </w:rPr>
+    </w:lvl>
+    <w:lvl w:ilvl="8" w:tplc="080A0005" w:tentative="1">
+      <w:start w:val="1"/>
+      <w:numFmt w:val="bullet"/>
+      <w:lvlText w:val=""/>
+      <w:lvlJc w:val="left"/>
+      <w:pPr>
+        <w:ind w:left="6480" w:hanging="360"/>
+      </w:pPr>
+      <w:rPr>
+        <w:rFonts w:ascii="Wingdings" w:hAnsi="Wingdings" w:hint="default"/>
+      </w:rPr>
+    </w:lvl>
+  </w:abstractNum>
+  <w:abstractNum w:abstractNumId="1" w15:restartNumberingAfterBreak="0">
+    <w:nsid w:val="015843F5"/>
+    <w:multiLevelType w:val="hybridMultilevel"/>
+    <w:tmpl w:val="AB1E40B4"/>
+    <w:lvl w:ilvl="0" w:tplc="080A0001">
+      <w:start w:val="1"/>
+      <w:numFmt w:val="bullet"/>
+      <w:lvlText w:val=""/>
+      <w:lvlJc w:val="left"/>
+      <w:pPr>
+        <w:ind w:left="720" w:hanging="360"/>
+      </w:pPr>
+      <w:rPr>
+        <w:rFonts w:ascii="Symbol" w:hAnsi="Symbol" w:hint="default"/>
+      </w:rPr>
+    </w:lvl>
+    <w:lvl w:ilvl="1" w:tplc="080A0003" w:tentative="1">
+      <w:start w:val="1"/>
+      <w:numFmt w:val="bullet"/>
+      <w:lvlText w:val="o"/>
+      <w:lvlJc w:val="left"/>
+      <w:pPr>
+        <w:ind w:left="1440" w:hanging="360"/>
+      </w:pPr>
+      <w:rPr>
+        <w:rFonts w:ascii="Courier New" w:hAnsi="Courier New" w:cs="Courier New" w:hint="default"/>
+      </w:rPr>
+    </w:lvl>
+    <w:lvl w:ilvl="2" w:tplc="080A0005" w:tentative="1">
+      <w:start w:val="1"/>
+      <w:numFmt w:val="bullet"/>
+      <w:lvlText w:val=""/>
+      <w:lvlJc w:val="left"/>
+      <w:pPr>
+        <w:ind w:left="2160" w:hanging="360"/>
+      </w:pPr>
+      <w:rPr>
+        <w:rFonts w:ascii="Wingdings" w:hAnsi="Wingdings" w:hint="default"/>
+      </w:rPr>
+    </w:lvl>
+    <w:lvl w:ilvl="3" w:tplc="080A0001" w:tentative="1">
+      <w:start w:val="1"/>
+      <w:numFmt w:val="bullet"/>
+      <w:lvlText w:val=""/>
+      <w:lvlJc w:val="left"/>
+      <w:pPr>
+        <w:ind w:left="2880" w:hanging="360"/>
+      </w:pPr>
+      <w:rPr>
+        <w:rFonts w:ascii="Symbol" w:hAnsi="Symbol" w:hint="default"/>
+      </w:rPr>
+    </w:lvl>
+    <w:lvl w:ilvl="4" w:tplc="080A0003" w:tentative="1">
+      <w:start w:val="1"/>
+      <w:numFmt w:val="bullet"/>
+      <w:lvlText w:val="o"/>
+      <w:lvlJc w:val="left"/>
+      <w:pPr>
+        <w:ind w:left="3600" w:hanging="360"/>
+      </w:pPr>
+      <w:rPr>
+        <w:rFonts w:ascii="Courier New" w:hAnsi="Courier New" w:cs="Courier New" w:hint="default"/>
+      </w:rPr>
+    </w:lvl>
+    <w:lvl w:ilvl="5" w:tplc="080A0005" w:tentative="1">
+      <w:start w:val="1"/>
+      <w:numFmt w:val="bullet"/>
+      <w:lvlText w:val=""/>
+      <w:lvlJc w:val="left"/>
+      <w:pPr>
+        <w:ind w:left="4320" w:hanging="360"/>
+      </w:pPr>
+      <w:rPr>
+        <w:rFonts w:ascii="Wingdings" w:hAnsi="Wingdings" w:hint="default"/>
+      </w:rPr>
+    </w:lvl>
+    <w:lvl w:ilvl="6" w:tplc="080A0001" w:tentative="1">
+      <w:start w:val="1"/>
+      <w:numFmt w:val="bullet"/>
+      <w:lvlText w:val=""/>
+      <w:lvlJc w:val="left"/>
+      <w:pPr>
+        <w:ind w:left="5040" w:hanging="360"/>
+      </w:pPr>
+      <w:rPr>
+        <w:rFonts w:ascii="Symbol" w:hAnsi="Symbol" w:hint="default"/>
+      </w:rPr>
+    </w:lvl>
+    <w:lvl w:ilvl="7" w:tplc="080A0003" w:tentative="1">
+      <w:start w:val="1"/>
+      <w:numFmt w:val="bullet"/>
+      <w:lvlText w:val="o"/>
+      <w:lvlJc w:val="left"/>
+      <w:pPr>
+        <w:ind w:left="5760" w:hanging="360"/>
+      </w:pPr>
+      <w:rPr>
+        <w:rFonts w:ascii="Courier New" w:hAnsi="Courier New" w:cs="Courier New" w:hint="default"/>
+      </w:rPr>
+    </w:lvl>
+    <w:lvl w:ilvl="8" w:tplc="080A0005" w:tentative="1">
+      <w:start w:val="1"/>
+      <w:numFmt w:val="bullet"/>
+      <w:lvlText w:val=""/>
+      <w:lvlJc w:val="left"/>
+      <w:pPr>
+        <w:ind w:left="6480" w:hanging="360"/>
+      </w:pPr>
+      <w:rPr>
+        <w:rFonts w:ascii="Wingdings" w:hAnsi="Wingdings" w:hint="default"/>
+      </w:rPr>
+    </w:lvl>
+  </w:abstractNum>
+  <w:abstractNum w:abstractNumId="2" w15:restartNumberingAfterBreak="0">
+    <w:nsid w:val="157D1AB8"/>
+    <w:multiLevelType w:val="hybridMultilevel"/>
+    <w:tmpl w:val="15F6E3B6"/>
+    <w:lvl w:ilvl="0" w:tplc="080A0001">
+      <w:start w:val="1"/>
+      <w:numFmt w:val="bullet"/>
+      <w:lvlText w:val=""/>
+      <w:lvlJc w:val="left"/>
+      <w:pPr>
+        <w:ind w:left="720" w:hanging="360"/>
+      </w:pPr>
+      <w:rPr>
+        <w:rFonts w:ascii="Symbol" w:hAnsi="Symbol" w:hint="default"/>
+      </w:rPr>
+    </w:lvl>
+    <w:lvl w:ilvl="1" w:tplc="FFFFFFFF" w:tentative="1">
+      <w:start w:val="1"/>
+      <w:numFmt w:val="lowerLetter"/>
+      <w:lvlText w:val="%2."/>
+      <w:lvlJc w:val="left"/>
+      <w:pPr>
+        <w:ind w:left="1440" w:hanging="360"/>
+      </w:pPr>
+    </w:lvl>
+    <w:lvl w:ilvl="2" w:tplc="FFFFFFFF" w:tentative="1">
+      <w:start w:val="1"/>
+      <w:numFmt w:val="lowerRoman"/>
+      <w:lvlText w:val="%3."/>
+      <w:lvlJc w:val="right"/>
+      <w:pPr>
+        <w:ind w:left="2160" w:hanging="180"/>
+      </w:pPr>
+    </w:lvl>
+    <w:lvl w:ilvl="3" w:tplc="FFFFFFFF" w:tentative="1">
+      <w:start w:val="1"/>
+      <w:numFmt w:val="decimal"/>
+      <w:lvlText w:val="%4."/>
+      <w:lvlJc w:val="left"/>
+      <w:pPr>
+        <w:ind w:left="2880" w:hanging="360"/>
+      </w:pPr>
+    </w:lvl>
+    <w:lvl w:ilvl="4" w:tplc="FFFFFFFF" w:tentative="1">
+      <w:start w:val="1"/>
+      <w:numFmt w:val="lowerLetter"/>
+      <w:lvlText w:val="%5."/>
+      <w:lvlJc w:val="left"/>
+      <w:pPr>
+        <w:ind w:left="3600" w:hanging="360"/>
+      </w:pPr>
+    </w:lvl>
+    <w:lvl w:ilvl="5" w:tplc="FFFFFFFF" w:tentative="1">
+      <w:start w:val="1"/>
+      <w:numFmt w:val="lowerRoman"/>
+      <w:lvlText w:val="%6."/>
+      <w:lvlJc w:val="right"/>
+      <w:pPr>
+        <w:ind w:left="4320" w:hanging="180"/>
+      </w:pPr>
+    </w:lvl>
+    <w:lvl w:ilvl="6" w:tplc="FFFFFFFF" w:tentative="1">
+      <w:start w:val="1"/>
+      <w:numFmt w:val="decimal"/>
+      <w:lvlText w:val="%7."/>
+      <w:lvlJc w:val="left"/>
+      <w:pPr>
+        <w:ind w:left="5040" w:hanging="360"/>
+      </w:pPr>
+    </w:lvl>
+    <w:lvl w:ilvl="7" w:tplc="FFFFFFFF" w:tentative="1">
+      <w:start w:val="1"/>
+      <w:numFmt w:val="lowerLetter"/>
+      <w:lvlText w:val="%8."/>
+      <w:lvlJc w:val="left"/>
+      <w:pPr>
+        <w:ind w:left="5760" w:hanging="360"/>
+      </w:pPr>
+    </w:lvl>
+    <w:lvl w:ilvl="8" w:tplc="FFFFFFFF" w:tentative="1">
+      <w:start w:val="1"/>
+      <w:numFmt w:val="lowerRoman"/>
+      <w:lvlText w:val="%9."/>
+      <w:lvlJc w:val="right"/>
+      <w:pPr>
+        <w:ind w:left="6480" w:hanging="180"/>
+      </w:pPr>
+    </w:lvl>
+  </w:abstractNum>
+  <w:abstractNum w:abstractNumId="3" w15:restartNumberingAfterBreak="0">
+    <w:nsid w:val="167F31B4"/>
+    <w:multiLevelType w:val="hybridMultilevel"/>
+    <w:tmpl w:val="6B4A4EBA"/>
+    <w:lvl w:ilvl="0" w:tplc="080A0001">
+      <w:start w:val="1"/>
+      <w:numFmt w:val="bullet"/>
+      <w:lvlText w:val=""/>
+      <w:lvlJc w:val="left"/>
+      <w:pPr>
+        <w:ind w:left="720" w:hanging="360"/>
+      </w:pPr>
+      <w:rPr>
+        <w:rFonts w:ascii="Symbol" w:hAnsi="Symbol" w:hint="default"/>
+      </w:rPr>
+    </w:lvl>
+    <w:lvl w:ilvl="1" w:tplc="FFFFFFFF" w:tentative="1">
+      <w:start w:val="1"/>
+      <w:numFmt w:val="lowerLetter"/>
+      <w:lvlText w:val="%2."/>
+      <w:lvlJc w:val="left"/>
+      <w:pPr>
+        <w:ind w:left="1440" w:hanging="360"/>
+      </w:pPr>
+    </w:lvl>
+    <w:lvl w:ilvl="2" w:tplc="FFFFFFFF" w:tentative="1">
+      <w:start w:val="1"/>
+      <w:numFmt w:val="lowerRoman"/>
+      <w:lvlText w:val="%3."/>
+      <w:lvlJc w:val="right"/>
+      <w:pPr>
+        <w:ind w:left="2160" w:hanging="180"/>
+      </w:pPr>
+    </w:lvl>
+    <w:lvl w:ilvl="3" w:tplc="FFFFFFFF" w:tentative="1">
+      <w:start w:val="1"/>
+      <w:numFmt w:val="decimal"/>
+      <w:lvlText w:val="%4."/>
+      <w:lvlJc w:val="left"/>
+      <w:pPr>
+        <w:ind w:left="2880" w:hanging="360"/>
+      </w:pPr>
+    </w:lvl>
+    <w:lvl w:ilvl="4" w:tplc="FFFFFFFF" w:tentative="1">
+      <w:start w:val="1"/>
+      <w:numFmt w:val="lowerLetter"/>
+      <w:lvlText w:val="%5."/>
+      <w:lvlJc w:val="left"/>
+      <w:pPr>
+        <w:ind w:left="3600" w:hanging="360"/>
+      </w:pPr>
+    </w:lvl>
+    <w:lvl w:ilvl="5" w:tplc="FFFFFFFF" w:tentative="1">
+      <w:start w:val="1"/>
+      <w:numFmt w:val="lowerRoman"/>
+      <w:lvlText w:val="%6."/>
+      <w:lvlJc w:val="right"/>
+      <w:pPr>
+        <w:ind w:left="4320" w:hanging="180"/>
+      </w:pPr>
+    </w:lvl>
+    <w:lvl w:ilvl="6" w:tplc="FFFFFFFF" w:tentative="1">
+      <w:start w:val="1"/>
+      <w:numFmt w:val="decimal"/>
+      <w:lvlText w:val="%7."/>
+      <w:lvlJc w:val="left"/>
+      <w:pPr>
+        <w:ind w:left="5040" w:hanging="360"/>
+      </w:pPr>
+    </w:lvl>
+    <w:lvl w:ilvl="7" w:tplc="FFFFFFFF" w:tentative="1">
+      <w:start w:val="1"/>
+      <w:numFmt w:val="lowerLetter"/>
+      <w:lvlText w:val="%8."/>
+      <w:lvlJc w:val="left"/>
+      <w:pPr>
+        <w:ind w:left="5760" w:hanging="360"/>
+      </w:pPr>
+    </w:lvl>
+    <w:lvl w:ilvl="8" w:tplc="FFFFFFFF" w:tentative="1">
+      <w:start w:val="1"/>
+      <w:numFmt w:val="lowerRoman"/>
+      <w:lvlText w:val="%9."/>
+      <w:lvlJc w:val="right"/>
+      <w:pPr>
+        <w:ind w:left="6480" w:hanging="180"/>
+      </w:pPr>
+    </w:lvl>
+  </w:abstractNum>
+  <w:abstractNum w:abstractNumId="4" w15:restartNumberingAfterBreak="0">
     <w:nsid w:val="22B76E21"/>
     <w:multiLevelType w:val="hybridMultilevel"/>
     <w:tmpl w:val="8536EEBA"/>
@@ -915,7 +1783,7 @@
       </w:rPr>
     </w:lvl>
   </w:abstractNum>
-  <w:abstractNum w:abstractNumId="1" w15:restartNumberingAfterBreak="0">
+  <w:abstractNum w:abstractNumId="5" w15:restartNumberingAfterBreak="0">
     <w:nsid w:val="236174E0"/>
     <w:multiLevelType w:val="multilevel"/>
     <w:tmpl w:val="061EF19C"/>
@@ -1064,7 +1932,7 @@
       </w:rPr>
     </w:lvl>
   </w:abstractNum>
-  <w:abstractNum w:abstractNumId="2" w15:restartNumberingAfterBreak="0">
+  <w:abstractNum w:abstractNumId="6" w15:restartNumberingAfterBreak="0">
     <w:nsid w:val="373079A2"/>
     <w:multiLevelType w:val="multilevel"/>
     <w:tmpl w:val="1B807A0C"/>
@@ -1213,7 +2081,209 @@
       </w:rPr>
     </w:lvl>
   </w:abstractNum>
-  <w:abstractNum w:abstractNumId="3" w15:restartNumberingAfterBreak="0">
+  <w:abstractNum w:abstractNumId="7" w15:restartNumberingAfterBreak="0">
+    <w:nsid w:val="481E63BF"/>
+    <w:multiLevelType w:val="hybridMultilevel"/>
+    <w:tmpl w:val="7A7A14EE"/>
+    <w:lvl w:ilvl="0" w:tplc="080A0001">
+      <w:start w:val="1"/>
+      <w:numFmt w:val="bullet"/>
+      <w:lvlText w:val=""/>
+      <w:lvlJc w:val="left"/>
+      <w:pPr>
+        <w:ind w:left="720" w:hanging="360"/>
+      </w:pPr>
+      <w:rPr>
+        <w:rFonts w:ascii="Symbol" w:hAnsi="Symbol" w:hint="default"/>
+      </w:rPr>
+    </w:lvl>
+    <w:lvl w:ilvl="1" w:tplc="FFFFFFFF" w:tentative="1">
+      <w:start w:val="1"/>
+      <w:numFmt w:val="lowerLetter"/>
+      <w:lvlText w:val="%2."/>
+      <w:lvlJc w:val="left"/>
+      <w:pPr>
+        <w:ind w:left="1440" w:hanging="360"/>
+      </w:pPr>
+    </w:lvl>
+    <w:lvl w:ilvl="2" w:tplc="FFFFFFFF" w:tentative="1">
+      <w:start w:val="1"/>
+      <w:numFmt w:val="lowerRoman"/>
+      <w:lvlText w:val="%3."/>
+      <w:lvlJc w:val="right"/>
+      <w:pPr>
+        <w:ind w:left="2160" w:hanging="180"/>
+      </w:pPr>
+    </w:lvl>
+    <w:lvl w:ilvl="3" w:tplc="FFFFFFFF" w:tentative="1">
+      <w:start w:val="1"/>
+      <w:numFmt w:val="decimal"/>
+      <w:lvlText w:val="%4."/>
+      <w:lvlJc w:val="left"/>
+      <w:pPr>
+        <w:ind w:left="2880" w:hanging="360"/>
+      </w:pPr>
+    </w:lvl>
+    <w:lvl w:ilvl="4" w:tplc="FFFFFFFF" w:tentative="1">
+      <w:start w:val="1"/>
+      <w:numFmt w:val="lowerLetter"/>
+      <w:lvlText w:val="%5."/>
+      <w:lvlJc w:val="left"/>
+      <w:pPr>
+        <w:ind w:left="3600" w:hanging="360"/>
+      </w:pPr>
+    </w:lvl>
+    <w:lvl w:ilvl="5" w:tplc="FFFFFFFF" w:tentative="1">
+      <w:start w:val="1"/>
+      <w:numFmt w:val="lowerRoman"/>
+      <w:lvlText w:val="%6."/>
+      <w:lvlJc w:val="right"/>
+      <w:pPr>
+        <w:ind w:left="4320" w:hanging="180"/>
+      </w:pPr>
+    </w:lvl>
+    <w:lvl w:ilvl="6" w:tplc="FFFFFFFF" w:tentative="1">
+      <w:start w:val="1"/>
+      <w:numFmt w:val="decimal"/>
+      <w:lvlText w:val="%7."/>
+      <w:lvlJc w:val="left"/>
+      <w:pPr>
+        <w:ind w:left="5040" w:hanging="360"/>
+      </w:pPr>
+    </w:lvl>
+    <w:lvl w:ilvl="7" w:tplc="FFFFFFFF" w:tentative="1">
+      <w:start w:val="1"/>
+      <w:numFmt w:val="lowerLetter"/>
+      <w:lvlText w:val="%8."/>
+      <w:lvlJc w:val="left"/>
+      <w:pPr>
+        <w:ind w:left="5760" w:hanging="360"/>
+      </w:pPr>
+    </w:lvl>
+    <w:lvl w:ilvl="8" w:tplc="FFFFFFFF" w:tentative="1">
+      <w:start w:val="1"/>
+      <w:numFmt w:val="lowerRoman"/>
+      <w:lvlText w:val="%9."/>
+      <w:lvlJc w:val="right"/>
+      <w:pPr>
+        <w:ind w:left="6480" w:hanging="180"/>
+      </w:pPr>
+    </w:lvl>
+  </w:abstractNum>
+  <w:abstractNum w:abstractNumId="8" w15:restartNumberingAfterBreak="0">
+    <w:nsid w:val="48634CEA"/>
+    <w:multiLevelType w:val="hybridMultilevel"/>
+    <w:tmpl w:val="FCBE98C0"/>
+    <w:lvl w:ilvl="0" w:tplc="080A0001">
+      <w:start w:val="1"/>
+      <w:numFmt w:val="bullet"/>
+      <w:lvlText w:val=""/>
+      <w:lvlJc w:val="left"/>
+      <w:pPr>
+        <w:ind w:left="720" w:hanging="360"/>
+      </w:pPr>
+      <w:rPr>
+        <w:rFonts w:ascii="Symbol" w:hAnsi="Symbol" w:hint="default"/>
+      </w:rPr>
+    </w:lvl>
+    <w:lvl w:ilvl="1" w:tplc="080A0003" w:tentative="1">
+      <w:start w:val="1"/>
+      <w:numFmt w:val="bullet"/>
+      <w:lvlText w:val="o"/>
+      <w:lvlJc w:val="left"/>
+      <w:pPr>
+        <w:ind w:left="1440" w:hanging="360"/>
+      </w:pPr>
+      <w:rPr>
+        <w:rFonts w:ascii="Courier New" w:hAnsi="Courier New" w:cs="Courier New" w:hint="default"/>
+      </w:rPr>
+    </w:lvl>
+    <w:lvl w:ilvl="2" w:tplc="080A0005" w:tentative="1">
+      <w:start w:val="1"/>
+      <w:numFmt w:val="bullet"/>
+      <w:lvlText w:val=""/>
+      <w:lvlJc w:val="left"/>
+      <w:pPr>
+        <w:ind w:left="2160" w:hanging="360"/>
+      </w:pPr>
+      <w:rPr>
+        <w:rFonts w:ascii="Wingdings" w:hAnsi="Wingdings" w:hint="default"/>
+      </w:rPr>
+    </w:lvl>
+    <w:lvl w:ilvl="3" w:tplc="080A0001" w:tentative="1">
+      <w:start w:val="1"/>
+      <w:numFmt w:val="bullet"/>
+      <w:lvlText w:val=""/>
+      <w:lvlJc w:val="left"/>
+      <w:pPr>
+        <w:ind w:left="2880" w:hanging="360"/>
+      </w:pPr>
+      <w:rPr>
+        <w:rFonts w:ascii="Symbol" w:hAnsi="Symbol" w:hint="default"/>
+      </w:rPr>
+    </w:lvl>
+    <w:lvl w:ilvl="4" w:tplc="080A0003" w:tentative="1">
+      <w:start w:val="1"/>
+      <w:numFmt w:val="bullet"/>
+      <w:lvlText w:val="o"/>
+      <w:lvlJc w:val="left"/>
+      <w:pPr>
+        <w:ind w:left="3600" w:hanging="360"/>
+      </w:pPr>
+      <w:rPr>
+        <w:rFonts w:ascii="Courier New" w:hAnsi="Courier New" w:cs="Courier New" w:hint="default"/>
+      </w:rPr>
+    </w:lvl>
+    <w:lvl w:ilvl="5" w:tplc="080A0005" w:tentative="1">
+      <w:start w:val="1"/>
+      <w:numFmt w:val="bullet"/>
+      <w:lvlText w:val=""/>
+      <w:lvlJc w:val="left"/>
+      <w:pPr>
+        <w:ind w:left="4320" w:hanging="360"/>
+      </w:pPr>
+      <w:rPr>
+        <w:rFonts w:ascii="Wingdings" w:hAnsi="Wingdings" w:hint="default"/>
+      </w:rPr>
+    </w:lvl>
+    <w:lvl w:ilvl="6" w:tplc="080A0001" w:tentative="1">
+      <w:start w:val="1"/>
+      <w:numFmt w:val="bullet"/>
+      <w:lvlText w:val=""/>
+      <w:lvlJc w:val="left"/>
+      <w:pPr>
+        <w:ind w:left="5040" w:hanging="360"/>
+      </w:pPr>
+      <w:rPr>
+        <w:rFonts w:ascii="Symbol" w:hAnsi="Symbol" w:hint="default"/>
+      </w:rPr>
+    </w:lvl>
+    <w:lvl w:ilvl="7" w:tplc="080A0003" w:tentative="1">
+      <w:start w:val="1"/>
+      <w:numFmt w:val="bullet"/>
+      <w:lvlText w:val="o"/>
+      <w:lvlJc w:val="left"/>
+      <w:pPr>
+        <w:ind w:left="5760" w:hanging="360"/>
+      </w:pPr>
+      <w:rPr>
+        <w:rFonts w:ascii="Courier New" w:hAnsi="Courier New" w:cs="Courier New" w:hint="default"/>
+      </w:rPr>
+    </w:lvl>
+    <w:lvl w:ilvl="8" w:tplc="080A0005" w:tentative="1">
+      <w:start w:val="1"/>
+      <w:numFmt w:val="bullet"/>
+      <w:lvlText w:val=""/>
+      <w:lvlJc w:val="left"/>
+      <w:pPr>
+        <w:ind w:left="6480" w:hanging="360"/>
+      </w:pPr>
+      <w:rPr>
+        <w:rFonts w:ascii="Wingdings" w:hAnsi="Wingdings" w:hint="default"/>
+      </w:rPr>
+    </w:lvl>
+  </w:abstractNum>
+  <w:abstractNum w:abstractNumId="9" w15:restartNumberingAfterBreak="0">
     <w:nsid w:val="4D447CC3"/>
     <w:multiLevelType w:val="hybridMultilevel"/>
     <w:tmpl w:val="A732DCD6"/>
@@ -1302,7 +2372,7 @@
       </w:pPr>
     </w:lvl>
   </w:abstractNum>
-  <w:abstractNum w:abstractNumId="4" w15:restartNumberingAfterBreak="0">
+  <w:abstractNum w:abstractNumId="10" w15:restartNumberingAfterBreak="0">
     <w:nsid w:val="6B154924"/>
     <w:multiLevelType w:val="multilevel"/>
     <w:tmpl w:val="6B9812BA"/>
@@ -1451,7 +2521,120 @@
       </w:rPr>
     </w:lvl>
   </w:abstractNum>
-  <w:abstractNum w:abstractNumId="5" w15:restartNumberingAfterBreak="0">
+  <w:abstractNum w:abstractNumId="11" w15:restartNumberingAfterBreak="0">
+    <w:nsid w:val="6C9B48A7"/>
+    <w:multiLevelType w:val="hybridMultilevel"/>
+    <w:tmpl w:val="FD32F51A"/>
+    <w:lvl w:ilvl="0" w:tplc="080A0001">
+      <w:start w:val="1"/>
+      <w:numFmt w:val="bullet"/>
+      <w:lvlText w:val=""/>
+      <w:lvlJc w:val="left"/>
+      <w:pPr>
+        <w:ind w:left="720" w:hanging="360"/>
+      </w:pPr>
+      <w:rPr>
+        <w:rFonts w:ascii="Symbol" w:hAnsi="Symbol" w:hint="default"/>
+      </w:rPr>
+    </w:lvl>
+    <w:lvl w:ilvl="1" w:tplc="080A0003" w:tentative="1">
+      <w:start w:val="1"/>
+      <w:numFmt w:val="bullet"/>
+      <w:lvlText w:val="o"/>
+      <w:lvlJc w:val="left"/>
+      <w:pPr>
+        <w:ind w:left="1440" w:hanging="360"/>
+      </w:pPr>
+      <w:rPr>
+        <w:rFonts w:ascii="Courier New" w:hAnsi="Courier New" w:cs="Courier New" w:hint="default"/>
+      </w:rPr>
+    </w:lvl>
+    <w:lvl w:ilvl="2" w:tplc="080A0005" w:tentative="1">
+      <w:start w:val="1"/>
+      <w:numFmt w:val="bullet"/>
+      <w:lvlText w:val=""/>
+      <w:lvlJc w:val="left"/>
+      <w:pPr>
+        <w:ind w:left="2160" w:hanging="360"/>
+      </w:pPr>
+      <w:rPr>
+        <w:rFonts w:ascii="Wingdings" w:hAnsi="Wingdings" w:hint="default"/>
+      </w:rPr>
+    </w:lvl>
+    <w:lvl w:ilvl="3" w:tplc="080A0001" w:tentative="1">
+      <w:start w:val="1"/>
+      <w:numFmt w:val="bullet"/>
+      <w:lvlText w:val=""/>
+      <w:lvlJc w:val="left"/>
+      <w:pPr>
+        <w:ind w:left="2880" w:hanging="360"/>
+      </w:pPr>
+      <w:rPr>
+        <w:rFonts w:ascii="Symbol" w:hAnsi="Symbol" w:hint="default"/>
+      </w:rPr>
+    </w:lvl>
+    <w:lvl w:ilvl="4" w:tplc="080A0003" w:tentative="1">
+      <w:start w:val="1"/>
+      <w:numFmt w:val="bullet"/>
+      <w:lvlText w:val="o"/>
+      <w:lvlJc w:val="left"/>
+      <w:pPr>
+        <w:ind w:left="3600" w:hanging="360"/>
+      </w:pPr>
+      <w:rPr>
+        <w:rFonts w:ascii="Courier New" w:hAnsi="Courier New" w:cs="Courier New" w:hint="default"/>
+      </w:rPr>
+    </w:lvl>
+    <w:lvl w:ilvl="5" w:tplc="080A0005" w:tentative="1">
+      <w:start w:val="1"/>
+      <w:numFmt w:val="bullet"/>
+      <w:lvlText w:val=""/>
+      <w:lvlJc w:val="left"/>
+      <w:pPr>
+        <w:ind w:left="4320" w:hanging="360"/>
+      </w:pPr>
+      <w:rPr>
+        <w:rFonts w:ascii="Wingdings" w:hAnsi="Wingdings" w:hint="default"/>
+      </w:rPr>
+    </w:lvl>
+    <w:lvl w:ilvl="6" w:tplc="080A0001" w:tentative="1">
+      <w:start w:val="1"/>
+      <w:numFmt w:val="bullet"/>
+      <w:lvlText w:val=""/>
+      <w:lvlJc w:val="left"/>
+      <w:pPr>
+        <w:ind w:left="5040" w:hanging="360"/>
+      </w:pPr>
+      <w:rPr>
+        <w:rFonts w:ascii="Symbol" w:hAnsi="Symbol" w:hint="default"/>
+      </w:rPr>
+    </w:lvl>
+    <w:lvl w:ilvl="7" w:tplc="080A0003" w:tentative="1">
+      <w:start w:val="1"/>
+      <w:numFmt w:val="bullet"/>
+      <w:lvlText w:val="o"/>
+      <w:lvlJc w:val="left"/>
+      <w:pPr>
+        <w:ind w:left="5760" w:hanging="360"/>
+      </w:pPr>
+      <w:rPr>
+        <w:rFonts w:ascii="Courier New" w:hAnsi="Courier New" w:cs="Courier New" w:hint="default"/>
+      </w:rPr>
+    </w:lvl>
+    <w:lvl w:ilvl="8" w:tplc="080A0005" w:tentative="1">
+      <w:start w:val="1"/>
+      <w:numFmt w:val="bullet"/>
+      <w:lvlText w:val=""/>
+      <w:lvlJc w:val="left"/>
+      <w:pPr>
+        <w:ind w:left="6480" w:hanging="360"/>
+      </w:pPr>
+      <w:rPr>
+        <w:rFonts w:ascii="Wingdings" w:hAnsi="Wingdings" w:hint="default"/>
+      </w:rPr>
+    </w:lvl>
+  </w:abstractNum>
+  <w:abstractNum w:abstractNumId="12" w15:restartNumberingAfterBreak="0">
     <w:nsid w:val="71701F23"/>
     <w:multiLevelType w:val="multilevel"/>
     <w:tmpl w:val="4C968148"/>
@@ -1600,23 +2783,133 @@
       </w:rPr>
     </w:lvl>
   </w:abstractNum>
+  <w:abstractNum w:abstractNumId="13" w15:restartNumberingAfterBreak="0">
+    <w:nsid w:val="7F79111A"/>
+    <w:multiLevelType w:val="hybridMultilevel"/>
+    <w:tmpl w:val="57FA9670"/>
+    <w:lvl w:ilvl="0" w:tplc="080A000F">
+      <w:start w:val="1"/>
+      <w:numFmt w:val="decimal"/>
+      <w:lvlText w:val="%1."/>
+      <w:lvlJc w:val="left"/>
+      <w:pPr>
+        <w:ind w:left="720" w:hanging="360"/>
+      </w:pPr>
+    </w:lvl>
+    <w:lvl w:ilvl="1" w:tplc="080A0019" w:tentative="1">
+      <w:start w:val="1"/>
+      <w:numFmt w:val="lowerLetter"/>
+      <w:lvlText w:val="%2."/>
+      <w:lvlJc w:val="left"/>
+      <w:pPr>
+        <w:ind w:left="1440" w:hanging="360"/>
+      </w:pPr>
+    </w:lvl>
+    <w:lvl w:ilvl="2" w:tplc="080A001B" w:tentative="1">
+      <w:start w:val="1"/>
+      <w:numFmt w:val="lowerRoman"/>
+      <w:lvlText w:val="%3."/>
+      <w:lvlJc w:val="right"/>
+      <w:pPr>
+        <w:ind w:left="2160" w:hanging="180"/>
+      </w:pPr>
+    </w:lvl>
+    <w:lvl w:ilvl="3" w:tplc="080A000F" w:tentative="1">
+      <w:start w:val="1"/>
+      <w:numFmt w:val="decimal"/>
+      <w:lvlText w:val="%4."/>
+      <w:lvlJc w:val="left"/>
+      <w:pPr>
+        <w:ind w:left="2880" w:hanging="360"/>
+      </w:pPr>
+    </w:lvl>
+    <w:lvl w:ilvl="4" w:tplc="080A0019" w:tentative="1">
+      <w:start w:val="1"/>
+      <w:numFmt w:val="lowerLetter"/>
+      <w:lvlText w:val="%5."/>
+      <w:lvlJc w:val="left"/>
+      <w:pPr>
+        <w:ind w:left="3600" w:hanging="360"/>
+      </w:pPr>
+    </w:lvl>
+    <w:lvl w:ilvl="5" w:tplc="080A001B" w:tentative="1">
+      <w:start w:val="1"/>
+      <w:numFmt w:val="lowerRoman"/>
+      <w:lvlText w:val="%6."/>
+      <w:lvlJc w:val="right"/>
+      <w:pPr>
+        <w:ind w:left="4320" w:hanging="180"/>
+      </w:pPr>
+    </w:lvl>
+    <w:lvl w:ilvl="6" w:tplc="080A000F" w:tentative="1">
+      <w:start w:val="1"/>
+      <w:numFmt w:val="decimal"/>
+      <w:lvlText w:val="%7."/>
+      <w:lvlJc w:val="left"/>
+      <w:pPr>
+        <w:ind w:left="5040" w:hanging="360"/>
+      </w:pPr>
+    </w:lvl>
+    <w:lvl w:ilvl="7" w:tplc="080A0019" w:tentative="1">
+      <w:start w:val="1"/>
+      <w:numFmt w:val="lowerLetter"/>
+      <w:lvlText w:val="%8."/>
+      <w:lvlJc w:val="left"/>
+      <w:pPr>
+        <w:ind w:left="5760" w:hanging="360"/>
+      </w:pPr>
+    </w:lvl>
+    <w:lvl w:ilvl="8" w:tplc="080A001B" w:tentative="1">
+      <w:start w:val="1"/>
+      <w:numFmt w:val="lowerRoman"/>
+      <w:lvlText w:val="%9."/>
+      <w:lvlJc w:val="right"/>
+      <w:pPr>
+        <w:ind w:left="6480" w:hanging="180"/>
+      </w:pPr>
+    </w:lvl>
+  </w:abstractNum>
   <w:num w:numId="1" w16cid:durableId="665279749">
+    <w:abstractNumId w:val="9"/>
+  </w:num>
+  <w:num w:numId="2" w16cid:durableId="1798378016">
+    <w:abstractNumId w:val="10"/>
+  </w:num>
+  <w:num w:numId="3" w16cid:durableId="1061515351">
+    <w:abstractNumId w:val="5"/>
+  </w:num>
+  <w:num w:numId="4" w16cid:durableId="175122246">
+    <w:abstractNumId w:val="12"/>
+  </w:num>
+  <w:num w:numId="5" w16cid:durableId="1241479318">
+    <w:abstractNumId w:val="6"/>
+  </w:num>
+  <w:num w:numId="6" w16cid:durableId="1356082719">
+    <w:abstractNumId w:val="4"/>
+  </w:num>
+  <w:num w:numId="7" w16cid:durableId="1242451969">
+    <w:abstractNumId w:val="0"/>
+  </w:num>
+  <w:num w:numId="8" w16cid:durableId="1733307134">
+    <w:abstractNumId w:val="13"/>
+  </w:num>
+  <w:num w:numId="9" w16cid:durableId="1587224589">
+    <w:abstractNumId w:val="7"/>
+  </w:num>
+  <w:num w:numId="10" w16cid:durableId="2048791916">
+    <w:abstractNumId w:val="1"/>
+  </w:num>
+  <w:num w:numId="11" w16cid:durableId="1939949326">
     <w:abstractNumId w:val="3"/>
   </w:num>
-  <w:num w:numId="2" w16cid:durableId="1798378016">
-    <w:abstractNumId w:val="4"/>
+  <w:num w:numId="12" w16cid:durableId="197813423">
+    <w:abstractNumId w:val="11"/>
   </w:num>
-  <w:num w:numId="3" w16cid:durableId="1061515351">
-    <w:abstractNumId w:val="1"/>
-  </w:num>
-  <w:num w:numId="4" w16cid:durableId="175122246">
-    <w:abstractNumId w:val="5"/>
-  </w:num>
-  <w:num w:numId="5" w16cid:durableId="1241479318">
+  <w:num w:numId="13" w16cid:durableId="820461945">
     <w:abstractNumId w:val="2"/>
   </w:num>
-  <w:num w:numId="6" w16cid:durableId="1356082719">
-    <w:abstractNumId w:val="0"/>
+  <w:num w:numId="14" w16cid:durableId="877812430">
+    <w:abstractNumId w:val="8"/>
   </w:num>
 </w:numbering>
 </file>
@@ -2630,6 +3923,25 @@
       </w:tcPr>
     </w:tblStylePr>
   </w:style>
+  <w:style w:type="paragraph" w:styleId="NormalWeb">
+    <w:name w:val="Normal (Web)"/>
+    <w:basedOn w:val="Normal"/>
+    <w:uiPriority w:val="99"/>
+    <w:semiHidden/>
+    <w:unhideWhenUsed/>
+    <w:rsid w:val="00C20347"/>
+    <w:pPr>
+      <w:spacing w:before="100" w:beforeAutospacing="1" w:after="100" w:afterAutospacing="1" w:line="240" w:lineRule="auto"/>
+    </w:pPr>
+    <w:rPr>
+      <w:rFonts w:ascii="Times New Roman" w:eastAsia="Times New Roman" w:hAnsi="Times New Roman" w:cs="Times New Roman"/>
+      <w:kern w:val="0"/>
+      <w:sz w:val="24"/>
+      <w:szCs w:val="24"/>
+      <w:lang w:eastAsia="es-MX"/>
+      <w14:ligatures w14:val="none"/>
+    </w:rPr>
+  </w:style>
 </w:styles>
 </file>
 

</xml_diff>